<commit_message>
Lets start using this thing again!
I have started Microprocessor Applications 1, the best documentation will likely be found in the Digital Logic and MicroP1 classes. Electronic Circuits may have some documentation although less thorough.
</commit_message>
<xml_diff>
--- a/EEL3701_Digital_Logic/Homework/HW1/HW1.docx
+++ b/EEL3701_Digital_Logic/Homework/HW1/HW1.docx
@@ -26,6 +26,11 @@
     </w:p>
     <w:p>
       <w:pPr>
+        <w:pStyle w:val="ListParagraph"/>
+        <w:numPr>
+          <w:ilvl w:val="0"/>
+          <w:numId w:val="6"/>
+        </w:numPr>
         <w:rPr>
           <w:rFonts w:ascii="Times New Roman" w:hAnsi="Times New Roman" w:cs="Times New Roman"/>
           <w:sz w:val="24"/>
@@ -36,7 +41,7 @@
           <w:rFonts w:ascii="Times New Roman" w:hAnsi="Times New Roman" w:cs="Times New Roman"/>
           <w:sz w:val="24"/>
         </w:rPr>
-        <w:t>N/A</w:t>
+        <w:t>Section III: Simulating – Part E7, as explained below in ‘Problems Encountered’ Part 2.</w:t>
       </w:r>
     </w:p>
     <w:p>
@@ -63,6 +68,11 @@
     </w:p>
     <w:p>
       <w:pPr>
+        <w:pStyle w:val="ListParagraph"/>
+        <w:numPr>
+          <w:ilvl w:val="0"/>
+          <w:numId w:val="5"/>
+        </w:numPr>
         <w:rPr>
           <w:rFonts w:ascii="Times New Roman" w:hAnsi="Times New Roman" w:cs="Times New Roman"/>
           <w:sz w:val="24"/>
@@ -73,29 +83,122 @@
           <w:rFonts w:ascii="Times New Roman" w:hAnsi="Times New Roman" w:cs="Times New Roman"/>
           <w:sz w:val="24"/>
         </w:rPr>
-        <w:t>&lt;insert a brief summary of</w:t>
-      </w:r>
-      <w:r>
+        <w:t>I encountered issues with the Quartus Waveform simulation license. I had thought to start on HW1 before our first lab and did not see the Quartus Installation Instructions and installed Quartus from the website without knowing about the ModelSim portion. Fixed by following instruction.</w:t>
+      </w:r>
+    </w:p>
+    <w:p>
+      <w:pPr>
+        <w:pStyle w:val="ListParagraph"/>
+        <w:numPr>
+          <w:ilvl w:val="0"/>
+          <w:numId w:val="5"/>
+        </w:numPr>
         <w:rPr>
           <w:rFonts w:ascii="Times New Roman" w:hAnsi="Times New Roman" w:cs="Times New Roman"/>
           <w:sz w:val="24"/>
         </w:rPr>
-        <w:t xml:space="preserve"> </w:t>
-      </w:r>
-      <w:r>
-        <w:rPr>
-          <w:rFonts w:ascii="Times New Roman" w:hAnsi="Times New Roman" w:cs="Times New Roman"/>
-          <w:i/>
-          <w:sz w:val="24"/>
-        </w:rPr>
-        <w:t>all</w:t>
-      </w:r>
+      </w:pPr>
       <w:r>
         <w:rPr>
           <w:rFonts w:ascii="Times New Roman" w:hAnsi="Times New Roman" w:cs="Times New Roman"/>
           <w:sz w:val="24"/>
         </w:rPr>
-        <w:t xml:space="preserve"> problems encountered&gt;</w:t>
+        <w:t>Section III: Simulating – Part E7, I had set the board to be the MAX DE10 Lite and could not do a full compilation. The</w:t>
+      </w:r>
+      <w:r>
+        <w:rPr>
+          <w:rFonts w:ascii="Times New Roman" w:hAnsi="Times New Roman" w:cs="Times New Roman"/>
+          <w:sz w:val="24"/>
+        </w:rPr>
+        <w:t xml:space="preserve"> document</w:t>
+      </w:r>
+      <w:r>
+        <w:rPr>
+          <w:rFonts w:ascii="Times New Roman" w:hAnsi="Times New Roman" w:cs="Times New Roman"/>
+          <w:sz w:val="24"/>
+        </w:rPr>
+        <w:t xml:space="preserve"> says that Professor Schwartz was unable to do this section as well.</w:t>
+      </w:r>
+    </w:p>
+    <w:p>
+      <w:pPr>
+        <w:pStyle w:val="ListParagraph"/>
+        <w:keepNext/>
+      </w:pPr>
+      <w:r>
+        <w:rPr>
+          <w:rFonts w:ascii="Times New Roman" w:hAnsi="Times New Roman" w:cs="Times New Roman"/>
+          <w:sz w:val="24"/>
+        </w:rPr>
+        <w:drawing>
+          <wp:inline distT="0" distB="0" distL="0" distR="0" wp14:anchorId="1931B9E4" wp14:editId="6F98FA79">
+            <wp:extent cx="5676900" cy="3022078"/>
+            <wp:effectExtent l="0" t="0" r="0" b="6985"/>
+            <wp:docPr id="1852703754" name="Picture 1"/>
+            <wp:cNvGraphicFramePr>
+              <a:graphicFrameLocks xmlns:a="http://schemas.openxmlformats.org/drawingml/2006/main" noChangeAspect="1"/>
+            </wp:cNvGraphicFramePr>
+            <a:graphic xmlns:a="http://schemas.openxmlformats.org/drawingml/2006/main">
+              <a:graphicData uri="http://schemas.openxmlformats.org/drawingml/2006/picture">
+                <pic:pic xmlns:pic="http://schemas.openxmlformats.org/drawingml/2006/picture">
+                  <pic:nvPicPr>
+                    <pic:cNvPr id="1852703754" name=""/>
+                    <pic:cNvPicPr/>
+                  </pic:nvPicPr>
+                  <pic:blipFill>
+                    <a:blip r:embed="rId8"/>
+                    <a:stretch>
+                      <a:fillRect/>
+                    </a:stretch>
+                  </pic:blipFill>
+                  <pic:spPr>
+                    <a:xfrm>
+                      <a:off x="0" y="0"/>
+                      <a:ext cx="5676900" cy="3022078"/>
+                    </a:xfrm>
+                    <a:prstGeom prst="rect">
+                      <a:avLst/>
+                    </a:prstGeom>
+                  </pic:spPr>
+                </pic:pic>
+              </a:graphicData>
+            </a:graphic>
+          </wp:inline>
+        </w:drawing>
+      </w:r>
+    </w:p>
+    <w:p>
+      <w:pPr>
+        <w:pStyle w:val="Caption"/>
+        <w:ind w:firstLine="720"/>
+        <w:rPr>
+          <w:rFonts w:ascii="Times New Roman" w:hAnsi="Times New Roman" w:cs="Times New Roman"/>
+          <w:sz w:val="24"/>
+        </w:rPr>
+      </w:pPr>
+      <w:r>
+        <w:t xml:space="preserve">Figure </w:t>
+      </w:r>
+      <w:r>
+        <w:fldChar w:fldCharType="begin"/>
+      </w:r>
+      <w:r>
+        <w:instrText xml:space="preserve"> SEQ Figure \* ARABIC </w:instrText>
+      </w:r>
+      <w:r>
+        <w:fldChar w:fldCharType="separate"/>
+      </w:r>
+      <w:r>
+        <w:rPr>
+          <w:noProof/>
+        </w:rPr>
+        <w:t>1</w:t>
+      </w:r>
+      <w:r>
+        <w:fldChar w:fldCharType="end"/>
+      </w:r>
+      <w:r>
+        <w:t>: Section III - Simulation Part E7 Error</w:t>
       </w:r>
     </w:p>
     <w:p>
@@ -157,166 +260,396 @@
     </w:p>
     <w:p>
       <w:pPr>
+        <w:keepNext/>
+      </w:pPr>
+    </w:p>
+    <w:p>
+      <w:pPr>
+        <w:keepNext/>
+      </w:pPr>
+      <w:r>
+        <w:drawing>
+          <wp:inline distT="0" distB="0" distL="0" distR="0" wp14:anchorId="07E53B12" wp14:editId="0017CF1A">
+            <wp:extent cx="4419983" cy="2530059"/>
+            <wp:effectExtent l="0" t="0" r="0" b="3810"/>
+            <wp:docPr id="2071763442" name="Picture 1"/>
+            <wp:cNvGraphicFramePr>
+              <a:graphicFrameLocks xmlns:a="http://schemas.openxmlformats.org/drawingml/2006/main" noChangeAspect="1"/>
+            </wp:cNvGraphicFramePr>
+            <a:graphic xmlns:a="http://schemas.openxmlformats.org/drawingml/2006/main">
+              <a:graphicData uri="http://schemas.openxmlformats.org/drawingml/2006/picture">
+                <pic:pic xmlns:pic="http://schemas.openxmlformats.org/drawingml/2006/picture">
+                  <pic:nvPicPr>
+                    <pic:cNvPr id="2071763442" name=""/>
+                    <pic:cNvPicPr/>
+                  </pic:nvPicPr>
+                  <pic:blipFill>
+                    <a:blip r:embed="rId9"/>
+                    <a:stretch>
+                      <a:fillRect/>
+                    </a:stretch>
+                  </pic:blipFill>
+                  <pic:spPr>
+                    <a:xfrm>
+                      <a:off x="0" y="0"/>
+                      <a:ext cx="4419983" cy="2530059"/>
+                    </a:xfrm>
+                    <a:prstGeom prst="rect">
+                      <a:avLst/>
+                    </a:prstGeom>
+                  </pic:spPr>
+                </pic:pic>
+              </a:graphicData>
+            </a:graphic>
+          </wp:inline>
+        </w:drawing>
+      </w:r>
+    </w:p>
+    <w:p>
+      <w:pPr>
+        <w:pStyle w:val="Caption"/>
+      </w:pPr>
+      <w:r>
+        <w:t xml:space="preserve">Figure </w:t>
+      </w:r>
+      <w:r>
+        <w:fldChar w:fldCharType="begin"/>
+      </w:r>
+      <w:r>
+        <w:instrText xml:space="preserve"> SEQ Figure \* ARABIC </w:instrText>
+      </w:r>
+      <w:r>
+        <w:fldChar w:fldCharType="separate"/>
+      </w:r>
+      <w:r>
+        <w:rPr>
+          <w:noProof/>
+        </w:rPr>
+        <w:t>2</w:t>
+      </w:r>
+      <w:r>
+        <w:fldChar w:fldCharType="end"/>
+      </w:r>
+      <w:r>
+        <w:t xml:space="preserve">: </w:t>
+      </w:r>
+      <w:r>
+        <w:t xml:space="preserve">Section II: Design - Part E7: </w:t>
+      </w:r>
+      <w:r>
+        <w:t>Quartus Circuit Design</w:t>
+      </w:r>
+    </w:p>
+    <w:p>
+      <w:pPr>
+        <w:keepNext/>
+      </w:pPr>
+      <w:r>
+        <w:drawing>
+          <wp:inline distT="0" distB="0" distL="0" distR="0" wp14:anchorId="0F56B658" wp14:editId="0C9DFD41">
+            <wp:extent cx="6706181" cy="2034716"/>
+            <wp:effectExtent l="0" t="0" r="0" b="3810"/>
+            <wp:docPr id="223870426" name="Picture 1"/>
+            <wp:cNvGraphicFramePr>
+              <a:graphicFrameLocks xmlns:a="http://schemas.openxmlformats.org/drawingml/2006/main" noChangeAspect="1"/>
+            </wp:cNvGraphicFramePr>
+            <a:graphic xmlns:a="http://schemas.openxmlformats.org/drawingml/2006/main">
+              <a:graphicData uri="http://schemas.openxmlformats.org/drawingml/2006/picture">
+                <pic:pic xmlns:pic="http://schemas.openxmlformats.org/drawingml/2006/picture">
+                  <pic:nvPicPr>
+                    <pic:cNvPr id="223870426" name=""/>
+                    <pic:cNvPicPr/>
+                  </pic:nvPicPr>
+                  <pic:blipFill>
+                    <a:blip r:embed="rId10"/>
+                    <a:stretch>
+                      <a:fillRect/>
+                    </a:stretch>
+                  </pic:blipFill>
+                  <pic:spPr>
+                    <a:xfrm>
+                      <a:off x="0" y="0"/>
+                      <a:ext cx="6706181" cy="2034716"/>
+                    </a:xfrm>
+                    <a:prstGeom prst="rect">
+                      <a:avLst/>
+                    </a:prstGeom>
+                  </pic:spPr>
+                </pic:pic>
+              </a:graphicData>
+            </a:graphic>
+          </wp:inline>
+        </w:drawing>
+      </w:r>
+    </w:p>
+    <w:p>
+      <w:pPr>
+        <w:pStyle w:val="Caption"/>
+      </w:pPr>
+      <w:r>
+        <w:t xml:space="preserve">Figure </w:t>
+      </w:r>
+      <w:r>
+        <w:t>3</w:t>
+      </w:r>
+      <w:r>
+        <w:t xml:space="preserve">: </w:t>
+      </w:r>
+      <w:r>
+        <w:t xml:space="preserve">Section III: Simulating - Part E0: </w:t>
+      </w:r>
+      <w:r>
+        <w:t>Functional Simulation</w:t>
+      </w:r>
+    </w:p>
+    <w:p>
+      <w:pPr>
+        <w:keepNext/>
+      </w:pPr>
+      <w:r>
         <w:rPr>
           <w:rFonts w:ascii="Times New Roman" w:hAnsi="Times New Roman" w:cs="Times New Roman"/>
           <w:sz w:val="24"/>
         </w:rPr>
-      </w:pPr>
-      <w:r>
-        <w:rPr>
-          <w:rFonts w:ascii="Times New Roman" w:hAnsi="Times New Roman" w:cs="Times New Roman"/>
-          <w:sz w:val="24"/>
-        </w:rPr>
-        <w:t xml:space="preserve">&lt;insert copy of </w:t>
-      </w:r>
-      <w:r>
-        <w:rPr>
-          <w:rFonts w:ascii="Times New Roman" w:hAnsi="Times New Roman" w:cs="Times New Roman"/>
-          <w:sz w:val="24"/>
-        </w:rPr>
-        <w:t>homework</w:t>
-      </w:r>
-      <w:r>
-        <w:rPr>
-          <w:rFonts w:ascii="Times New Roman" w:hAnsi="Times New Roman" w:cs="Times New Roman"/>
-          <w:sz w:val="24"/>
-        </w:rPr>
-        <w:t xml:space="preserve"> problem numbers</w:t>
-      </w:r>
-      <w:r>
-        <w:rPr>
-          <w:rFonts w:ascii="Times New Roman" w:hAnsi="Times New Roman" w:cs="Times New Roman"/>
-          <w:sz w:val="24"/>
-        </w:rPr>
-        <w:t xml:space="preserve"> from </w:t>
-      </w:r>
-      <w:r>
-        <w:rPr>
-          <w:rFonts w:ascii="Times New Roman" w:hAnsi="Times New Roman" w:cs="Times New Roman"/>
-          <w:sz w:val="24"/>
-        </w:rPr>
-        <w:t>homework</w:t>
-      </w:r>
-      <w:r>
-        <w:rPr>
-          <w:rFonts w:ascii="Times New Roman" w:hAnsi="Times New Roman" w:cs="Times New Roman"/>
-          <w:sz w:val="24"/>
-        </w:rPr>
-        <w:t xml:space="preserve"> document, as well as an answer directly following each of the questions (if not applicable, write “N/A”)</w:t>
-      </w:r>
-      <w:r>
-        <w:rPr>
-          <w:rFonts w:ascii="Times New Roman" w:hAnsi="Times New Roman" w:cs="Times New Roman"/>
-          <w:sz w:val="24"/>
-        </w:rPr>
-        <w:t xml:space="preserve">; </w:t>
-      </w:r>
-      <w:r>
-        <w:rPr>
-          <w:rFonts w:ascii="Times New Roman" w:hAnsi="Times New Roman" w:cs="Times New Roman"/>
-          <w:sz w:val="24"/>
-        </w:rPr>
-        <w:t xml:space="preserve">also specify the Roth textbook version number you used; </w:t>
-      </w:r>
-      <w:r>
-        <w:rPr>
-          <w:rFonts w:ascii="Times New Roman" w:hAnsi="Times New Roman" w:cs="Times New Roman"/>
-          <w:sz w:val="24"/>
-        </w:rPr>
-        <w:t xml:space="preserve">all scans must be clear and </w:t>
-      </w:r>
-      <w:r>
-        <w:rPr>
-          <w:rFonts w:ascii="Times New Roman" w:hAnsi="Times New Roman" w:cs="Times New Roman"/>
-          <w:sz w:val="24"/>
-        </w:rPr>
-        <w:t>legible</w:t>
-      </w:r>
-      <w:r>
-        <w:rPr>
-          <w:rFonts w:ascii="Times New Roman" w:hAnsi="Times New Roman" w:cs="Times New Roman"/>
-          <w:sz w:val="24"/>
-        </w:rPr>
-        <w:t>&gt;</w:t>
+        <w:drawing>
+          <wp:inline distT="0" distB="0" distL="0" distR="0" wp14:anchorId="189D0A76" wp14:editId="5BA70BAF">
+            <wp:extent cx="3109229" cy="1889924"/>
+            <wp:effectExtent l="0" t="0" r="0" b="0"/>
+            <wp:docPr id="302359476" name="Picture 1"/>
+            <wp:cNvGraphicFramePr>
+              <a:graphicFrameLocks xmlns:a="http://schemas.openxmlformats.org/drawingml/2006/main" noChangeAspect="1"/>
+            </wp:cNvGraphicFramePr>
+            <a:graphic xmlns:a="http://schemas.openxmlformats.org/drawingml/2006/main">
+              <a:graphicData uri="http://schemas.openxmlformats.org/drawingml/2006/picture">
+                <pic:pic xmlns:pic="http://schemas.openxmlformats.org/drawingml/2006/picture">
+                  <pic:nvPicPr>
+                    <pic:cNvPr id="302359476" name=""/>
+                    <pic:cNvPicPr/>
+                  </pic:nvPicPr>
+                  <pic:blipFill>
+                    <a:blip r:embed="rId11"/>
+                    <a:stretch>
+                      <a:fillRect/>
+                    </a:stretch>
+                  </pic:blipFill>
+                  <pic:spPr>
+                    <a:xfrm>
+                      <a:off x="0" y="0"/>
+                      <a:ext cx="3109229" cy="1889924"/>
+                    </a:xfrm>
+                    <a:prstGeom prst="rect">
+                      <a:avLst/>
+                    </a:prstGeom>
+                  </pic:spPr>
+                </pic:pic>
+              </a:graphicData>
+            </a:graphic>
+          </wp:inline>
+        </w:drawing>
       </w:r>
     </w:p>
     <w:p>
       <w:pPr>
-        <w:rPr>
-          <w:rFonts w:ascii="Times New Roman" w:hAnsi="Times New Roman" w:cs="Times New Roman"/>
-          <w:sz w:val="24"/>
-        </w:rPr>
-      </w:pPr>
+        <w:pStyle w:val="Caption"/>
+      </w:pPr>
+      <w:r>
+        <w:t>Figure 4: Section III: Simulating – Part E2: Truth/Voltage Table</w:t>
+      </w:r>
     </w:p>
     <w:p>
       <w:pPr>
-        <w:rPr>
-          <w:rFonts w:ascii="Times New Roman" w:hAnsi="Times New Roman" w:cs="Times New Roman"/>
-          <w:sz w:val="36"/>
-          <w:highlight w:val="yellow"/>
-        </w:rPr>
-      </w:pPr>
-      <w:r>
-        <w:rPr>
-          <w:rFonts w:ascii="Times New Roman" w:hAnsi="Times New Roman" w:cs="Times New Roman"/>
-          <w:sz w:val="36"/>
-          <w:highlight w:val="yellow"/>
-        </w:rPr>
-        <w:t xml:space="preserve">THE ABOVE </w:t>
-      </w:r>
-      <w:r>
-        <w:rPr>
-          <w:rFonts w:ascii="Times New Roman" w:hAnsi="Times New Roman" w:cs="Times New Roman"/>
-          <w:sz w:val="36"/>
-          <w:highlight w:val="yellow"/>
-        </w:rPr>
-        <w:t>SHOULD BE FOLLOWED BY A PAGE BREAK</w:t>
-      </w:r>
-      <w:r>
-        <w:rPr>
-          <w:rFonts w:ascii="Times New Roman" w:hAnsi="Times New Roman" w:cs="Times New Roman"/>
-          <w:sz w:val="36"/>
-          <w:highlight w:val="yellow"/>
-        </w:rPr>
-        <w:t xml:space="preserve"> </w:t>
-      </w:r>
-      <w:r>
-        <w:rPr>
-          <w:rFonts w:ascii="Times New Roman" w:hAnsi="Times New Roman" w:cs="Times New Roman"/>
-          <w:sz w:val="36"/>
-          <w:highlight w:val="yellow"/>
-        </w:rPr>
-        <w:t>(ALREADY INCLUDED)</w:t>
-      </w:r>
-      <w:r>
-        <w:rPr>
-          <w:rFonts w:ascii="Times New Roman" w:hAnsi="Times New Roman" w:cs="Times New Roman"/>
-          <w:sz w:val="36"/>
-          <w:highlight w:val="yellow"/>
-        </w:rPr>
-        <w:t>, AND THIS SENTENCE OF TEXT SHOULD BE REMOVED</w:t>
-      </w:r>
-      <w:r>
-        <w:rPr>
-          <w:rFonts w:ascii="Times New Roman" w:hAnsi="Times New Roman" w:cs="Times New Roman"/>
-          <w:sz w:val="36"/>
-          <w:highlight w:val="yellow"/>
-        </w:rPr>
-        <w:t>.</w:t>
-      </w:r>
+        <w:keepNext/>
+      </w:pPr>
     </w:p>
     <w:p>
       <w:pPr>
-        <w:spacing w:line="259" w:lineRule="auto"/>
+        <w:keepNext/>
+      </w:pPr>
+      <w:r>
+        <w:drawing>
+          <wp:inline distT="0" distB="0" distL="0" distR="0" wp14:anchorId="4921950F" wp14:editId="28604A2D">
+            <wp:extent cx="6599492" cy="1562235"/>
+            <wp:effectExtent l="0" t="0" r="0" b="0"/>
+            <wp:docPr id="1837579092" name="Picture 1"/>
+            <wp:cNvGraphicFramePr>
+              <a:graphicFrameLocks xmlns:a="http://schemas.openxmlformats.org/drawingml/2006/main" noChangeAspect="1"/>
+            </wp:cNvGraphicFramePr>
+            <a:graphic xmlns:a="http://schemas.openxmlformats.org/drawingml/2006/main">
+              <a:graphicData uri="http://schemas.openxmlformats.org/drawingml/2006/picture">
+                <pic:pic xmlns:pic="http://schemas.openxmlformats.org/drawingml/2006/picture">
+                  <pic:nvPicPr>
+                    <pic:cNvPr id="1837579092" name=""/>
+                    <pic:cNvPicPr/>
+                  </pic:nvPicPr>
+                  <pic:blipFill>
+                    <a:blip r:embed="rId12"/>
+                    <a:stretch>
+                      <a:fillRect/>
+                    </a:stretch>
+                  </pic:blipFill>
+                  <pic:spPr>
+                    <a:xfrm>
+                      <a:off x="0" y="0"/>
+                      <a:ext cx="6599492" cy="1562235"/>
+                    </a:xfrm>
+                    <a:prstGeom prst="rect">
+                      <a:avLst/>
+                    </a:prstGeom>
+                  </pic:spPr>
+                </pic:pic>
+              </a:graphicData>
+            </a:graphic>
+          </wp:inline>
+        </w:drawing>
+      </w:r>
+    </w:p>
+    <w:p>
+      <w:pPr>
+        <w:pStyle w:val="Caption"/>
+      </w:pPr>
+      <w:r>
+        <w:t xml:space="preserve">Figure </w:t>
+      </w:r>
+      <w:r>
+        <w:t>5</w:t>
+      </w:r>
+      <w:r>
+        <w:t xml:space="preserve">: </w:t>
+      </w:r>
+      <w:r>
+        <w:t xml:space="preserve">Section III: Simulating Part E3: </w:t>
+      </w:r>
+      <w:r>
+        <w:t>Timing Simulation</w:t>
+      </w:r>
+    </w:p>
+    <w:p>
+      <w:pPr>
         <w:rPr>
-          <w:rFonts w:ascii="Times New Roman" w:hAnsi="Times New Roman" w:cs="Times New Roman"/>
-          <w:sz w:val="24"/>
+          <w:b/>
+          <w:bCs/>
         </w:rPr>
       </w:pPr>
+      <w:r>
+        <w:rPr>
+          <w:b/>
+          <w:bCs/>
+        </w:rPr>
+        <w:t>Error with Section III: Simulating Part E7 mentioned in ‘Problems Encountered’.</w:t>
+      </w:r>
+    </w:p>
+    <w:p>
+      <w:pPr>
+        <w:keepNext/>
+      </w:pPr>
+      <w:r>
+        <w:drawing>
+          <wp:inline distT="0" distB="0" distL="0" distR="0" wp14:anchorId="23EE02B9" wp14:editId="4CEACAB4">
+            <wp:extent cx="6027420" cy="1616454"/>
+            <wp:effectExtent l="0" t="0" r="0" b="3175"/>
+            <wp:docPr id="301326991" name="Picture 1"/>
+            <wp:cNvGraphicFramePr>
+              <a:graphicFrameLocks xmlns:a="http://schemas.openxmlformats.org/drawingml/2006/main" noChangeAspect="1"/>
+            </wp:cNvGraphicFramePr>
+            <a:graphic xmlns:a="http://schemas.openxmlformats.org/drawingml/2006/main">
+              <a:graphicData uri="http://schemas.openxmlformats.org/drawingml/2006/picture">
+                <pic:pic xmlns:pic="http://schemas.openxmlformats.org/drawingml/2006/picture">
+                  <pic:nvPicPr>
+                    <pic:cNvPr id="301326991" name=""/>
+                    <pic:cNvPicPr/>
+                  </pic:nvPicPr>
+                  <pic:blipFill>
+                    <a:blip r:embed="rId13"/>
+                    <a:stretch>
+                      <a:fillRect/>
+                    </a:stretch>
+                  </pic:blipFill>
+                  <pic:spPr>
+                    <a:xfrm>
+                      <a:off x="0" y="0"/>
+                      <a:ext cx="6057145" cy="1624426"/>
+                    </a:xfrm>
+                    <a:prstGeom prst="rect">
+                      <a:avLst/>
+                    </a:prstGeom>
+                  </pic:spPr>
+                </pic:pic>
+              </a:graphicData>
+            </a:graphic>
+          </wp:inline>
+        </w:drawing>
+      </w:r>
+    </w:p>
+    <w:p>
+      <w:pPr>
+        <w:pStyle w:val="Caption"/>
+      </w:pPr>
+      <w:r>
+        <w:t xml:space="preserve">Figure </w:t>
+      </w:r>
+      <w:r>
+        <w:t>6</w:t>
+      </w:r>
+      <w:r>
+        <w:t>: Section III: Simulating Part F</w:t>
+      </w:r>
+      <w:r>
+        <w:t>6: Grouping Functional Simulation</w:t>
+      </w:r>
+    </w:p>
+    <w:p>
+      <w:pPr>
+        <w:keepNext/>
+      </w:pPr>
+      <w:r>
+        <w:drawing>
+          <wp:inline distT="0" distB="0" distL="0" distR="0" wp14:anchorId="1F78085A" wp14:editId="4068E206">
+            <wp:extent cx="6019800" cy="843784"/>
+            <wp:effectExtent l="0" t="0" r="0" b="0"/>
+            <wp:docPr id="547205144" name="Picture 1"/>
+            <wp:cNvGraphicFramePr>
+              <a:graphicFrameLocks xmlns:a="http://schemas.openxmlformats.org/drawingml/2006/main" noChangeAspect="1"/>
+            </wp:cNvGraphicFramePr>
+            <a:graphic xmlns:a="http://schemas.openxmlformats.org/drawingml/2006/main">
+              <a:graphicData uri="http://schemas.openxmlformats.org/drawingml/2006/picture">
+                <pic:pic xmlns:pic="http://schemas.openxmlformats.org/drawingml/2006/picture">
+                  <pic:nvPicPr>
+                    <pic:cNvPr id="547205144" name=""/>
+                    <pic:cNvPicPr/>
+                  </pic:nvPicPr>
+                  <pic:blipFill>
+                    <a:blip r:embed="rId14"/>
+                    <a:stretch>
+                      <a:fillRect/>
+                    </a:stretch>
+                  </pic:blipFill>
+                  <pic:spPr>
+                    <a:xfrm>
+                      <a:off x="0" y="0"/>
+                      <a:ext cx="6065273" cy="850158"/>
+                    </a:xfrm>
+                    <a:prstGeom prst="rect">
+                      <a:avLst/>
+                    </a:prstGeom>
+                  </pic:spPr>
+                </pic:pic>
+              </a:graphicData>
+            </a:graphic>
+          </wp:inline>
+        </w:drawing>
+      </w:r>
+    </w:p>
+    <w:p>
+      <w:pPr>
+        <w:pStyle w:val="Caption"/>
+      </w:pPr>
+      <w:r>
+        <w:t>Figure 7: Section III: Simulating Part F6: Grouping Timing Simulation</w:t>
+      </w:r>
     </w:p>
     <w:sectPr>
-      <w:headerReference w:type="default" r:id="rId8"/>
-      <w:headerReference w:type="first" r:id="rId9"/>
+      <w:headerReference w:type="default" r:id="rId15"/>
+      <w:headerReference w:type="first" r:id="rId16"/>
       <w:pgSz w:w="12240" w:h="15840"/>
       <w:pgMar w:top="576" w:right="648" w:bottom="806" w:left="648" w:header="288" w:footer="144" w:gutter="0"/>
       <w:cols w:space="720"/>
@@ -1156,6 +1489,119 @@
 <file path=word/numbering.xml><?xml version="1.0" encoding="utf-8"?>
 <w:numbering xmlns:wpc="http://schemas.microsoft.com/office/word/2010/wordprocessingCanvas" xmlns:cx="http://schemas.microsoft.com/office/drawing/2014/chartex" xmlns:cx1="http://schemas.microsoft.com/office/drawing/2015/9/8/chartex" xmlns:cx2="http://schemas.microsoft.com/office/drawing/2015/10/21/chartex" xmlns:cx3="http://schemas.microsoft.com/office/drawing/2016/5/9/chartex" xmlns:cx4="http://schemas.microsoft.com/office/drawing/2016/5/10/chartex" xmlns:cx5="http://schemas.microsoft.com/office/drawing/2016/5/11/chartex" xmlns:cx6="http://schemas.microsoft.com/office/drawing/2016/5/12/chartex" xmlns:cx7="http://schemas.microsoft.com/office/drawing/2016/5/13/chartex" xmlns:cx8="http://schemas.microsoft.com/office/drawing/2016/5/14/chartex" xmlns:mc="http://schemas.openxmlformats.org/markup-compatibility/2006" xmlns:aink="http://schemas.microsoft.com/office/drawing/2016/ink" xmlns:am3d="http://schemas.microsoft.com/office/drawing/2017/model3d" xmlns:o="urn:schemas-microsoft-com:office:office" xmlns:oel="http://schemas.microsoft.com/office/2019/extlst" xmlns:r="http://schemas.openxmlformats.org/officeDocument/2006/relationships" xmlns:m="http://schemas.openxmlformats.org/officeDocument/2006/math" xmlns:v="urn:schemas-microsoft-com:vml" xmlns:wp14="http://schemas.microsoft.com/office/word/2010/wordprocessingDrawing" xmlns:wp="http://schemas.openxmlformats.org/drawingml/2006/wordprocessingDrawing" xmlns:w10="urn:schemas-microsoft-com:office:word" xmlns:w="http://schemas.openxmlformats.org/wordprocessingml/2006/main" xmlns:w14="http://schemas.microsoft.com/office/word/2010/wordml" xmlns:w15="http://schemas.microsoft.com/office/word/2012/wordml" xmlns:w16cex="http://schemas.microsoft.com/office/word/2018/wordml/cex" xmlns:w16cid="http://schemas.microsoft.com/office/word/2016/wordml/cid" xmlns:w16="http://schemas.microsoft.com/office/word/2018/wordml" xmlns:w16du="http://schemas.microsoft.com/office/word/2023/wordml/word16du" xmlns:w16sdtdh="http://schemas.microsoft.com/office/word/2020/wordml/sdtdatahash" xmlns:w16sdtfl="http://schemas.microsoft.com/office/word/2024/wordml/sdtformatlock" xmlns:w16se="http://schemas.microsoft.com/office/word/2015/wordml/symex" xmlns:wpg="http://schemas.microsoft.com/office/word/2010/wordprocessingGroup" xmlns:wpi="http://schemas.microsoft.com/office/word/2010/wordprocessingInk" xmlns:wne="http://schemas.microsoft.com/office/word/2006/wordml" xmlns:wps="http://schemas.microsoft.com/office/word/2010/wordprocessingShape" mc:Ignorable="w14 w15 w16se w16cid w16 w16cex w16sdtdh w16sdtfl w16du wp14">
   <w:abstractNum w:abstractNumId="0" w15:restartNumberingAfterBreak="0">
+    <w:nsid w:val="020768F8"/>
+    <w:multiLevelType w:val="hybridMultilevel"/>
+    <w:tmpl w:val="52E47482"/>
+    <w:lvl w:ilvl="0" w:tplc="7C427D8E">
+      <w:start w:val="1"/>
+      <w:numFmt w:val="bullet"/>
+      <w:lvlText w:val="-"/>
+      <w:lvlJc w:val="left"/>
+      <w:pPr>
+        <w:ind w:left="720" w:hanging="360"/>
+      </w:pPr>
+      <w:rPr>
+        <w:rFonts w:ascii="Times New Roman" w:eastAsiaTheme="minorHAnsi" w:hAnsi="Times New Roman" w:cs="Times New Roman" w:hint="default"/>
+      </w:rPr>
+    </w:lvl>
+    <w:lvl w:ilvl="1" w:tplc="04090003" w:tentative="1">
+      <w:start w:val="1"/>
+      <w:numFmt w:val="bullet"/>
+      <w:lvlText w:val="o"/>
+      <w:lvlJc w:val="left"/>
+      <w:pPr>
+        <w:ind w:left="1440" w:hanging="360"/>
+      </w:pPr>
+      <w:rPr>
+        <w:rFonts w:ascii="Courier New" w:hAnsi="Courier New" w:cs="Courier New" w:hint="default"/>
+      </w:rPr>
+    </w:lvl>
+    <w:lvl w:ilvl="2" w:tplc="04090005" w:tentative="1">
+      <w:start w:val="1"/>
+      <w:numFmt w:val="bullet"/>
+      <w:lvlText w:val=""/>
+      <w:lvlJc w:val="left"/>
+      <w:pPr>
+        <w:ind w:left="2160" w:hanging="360"/>
+      </w:pPr>
+      <w:rPr>
+        <w:rFonts w:ascii="Wingdings" w:hAnsi="Wingdings" w:hint="default"/>
+      </w:rPr>
+    </w:lvl>
+    <w:lvl w:ilvl="3" w:tplc="04090001" w:tentative="1">
+      <w:start w:val="1"/>
+      <w:numFmt w:val="bullet"/>
+      <w:lvlText w:val=""/>
+      <w:lvlJc w:val="left"/>
+      <w:pPr>
+        <w:ind w:left="2880" w:hanging="360"/>
+      </w:pPr>
+      <w:rPr>
+        <w:rFonts w:ascii="Symbol" w:hAnsi="Symbol" w:hint="default"/>
+      </w:rPr>
+    </w:lvl>
+    <w:lvl w:ilvl="4" w:tplc="04090003" w:tentative="1">
+      <w:start w:val="1"/>
+      <w:numFmt w:val="bullet"/>
+      <w:lvlText w:val="o"/>
+      <w:lvlJc w:val="left"/>
+      <w:pPr>
+        <w:ind w:left="3600" w:hanging="360"/>
+      </w:pPr>
+      <w:rPr>
+        <w:rFonts w:ascii="Courier New" w:hAnsi="Courier New" w:cs="Courier New" w:hint="default"/>
+      </w:rPr>
+    </w:lvl>
+    <w:lvl w:ilvl="5" w:tplc="04090005" w:tentative="1">
+      <w:start w:val="1"/>
+      <w:numFmt w:val="bullet"/>
+      <w:lvlText w:val=""/>
+      <w:lvlJc w:val="left"/>
+      <w:pPr>
+        <w:ind w:left="4320" w:hanging="360"/>
+      </w:pPr>
+      <w:rPr>
+        <w:rFonts w:ascii="Wingdings" w:hAnsi="Wingdings" w:hint="default"/>
+      </w:rPr>
+    </w:lvl>
+    <w:lvl w:ilvl="6" w:tplc="04090001" w:tentative="1">
+      <w:start w:val="1"/>
+      <w:numFmt w:val="bullet"/>
+      <w:lvlText w:val=""/>
+      <w:lvlJc w:val="left"/>
+      <w:pPr>
+        <w:ind w:left="5040" w:hanging="360"/>
+      </w:pPr>
+      <w:rPr>
+        <w:rFonts w:ascii="Symbol" w:hAnsi="Symbol" w:hint="default"/>
+      </w:rPr>
+    </w:lvl>
+    <w:lvl w:ilvl="7" w:tplc="04090003" w:tentative="1">
+      <w:start w:val="1"/>
+      <w:numFmt w:val="bullet"/>
+      <w:lvlText w:val="o"/>
+      <w:lvlJc w:val="left"/>
+      <w:pPr>
+        <w:ind w:left="5760" w:hanging="360"/>
+      </w:pPr>
+      <w:rPr>
+        <w:rFonts w:ascii="Courier New" w:hAnsi="Courier New" w:cs="Courier New" w:hint="default"/>
+      </w:rPr>
+    </w:lvl>
+    <w:lvl w:ilvl="8" w:tplc="04090005" w:tentative="1">
+      <w:start w:val="1"/>
+      <w:numFmt w:val="bullet"/>
+      <w:lvlText w:val=""/>
+      <w:lvlJc w:val="left"/>
+      <w:pPr>
+        <w:ind w:left="6480" w:hanging="360"/>
+      </w:pPr>
+      <w:rPr>
+        <w:rFonts w:ascii="Wingdings" w:hAnsi="Wingdings" w:hint="default"/>
+      </w:rPr>
+    </w:lvl>
+  </w:abstractNum>
+  <w:abstractNum w:abstractNumId="1" w15:restartNumberingAfterBreak="0">
     <w:nsid w:val="045A11A4"/>
     <w:multiLevelType w:val="hybridMultilevel"/>
     <w:tmpl w:val="D72E7FF4"/>
@@ -1244,7 +1690,7 @@
       </w:pPr>
     </w:lvl>
   </w:abstractNum>
-  <w:abstractNum w:abstractNumId="1" w15:restartNumberingAfterBreak="0">
+  <w:abstractNum w:abstractNumId="2" w15:restartNumberingAfterBreak="0">
     <w:nsid w:val="1BA53194"/>
     <w:multiLevelType w:val="hybridMultilevel"/>
     <w:tmpl w:val="FD429582"/>
@@ -1333,7 +1779,7 @@
       </w:pPr>
     </w:lvl>
   </w:abstractNum>
-  <w:abstractNum w:abstractNumId="2" w15:restartNumberingAfterBreak="0">
+  <w:abstractNum w:abstractNumId="3" w15:restartNumberingAfterBreak="0">
     <w:nsid w:val="4FCF015F"/>
     <w:multiLevelType w:val="hybridMultilevel"/>
     <w:tmpl w:val="5C28F206"/>
@@ -1422,7 +1868,96 @@
       </w:pPr>
     </w:lvl>
   </w:abstractNum>
-  <w:abstractNum w:abstractNumId="3" w15:restartNumberingAfterBreak="0">
+  <w:abstractNum w:abstractNumId="4" w15:restartNumberingAfterBreak="0">
+    <w:nsid w:val="66D12666"/>
+    <w:multiLevelType w:val="hybridMultilevel"/>
+    <w:tmpl w:val="3F1EB050"/>
+    <w:lvl w:ilvl="0" w:tplc="0409000F">
+      <w:start w:val="1"/>
+      <w:numFmt w:val="decimal"/>
+      <w:lvlText w:val="%1."/>
+      <w:lvlJc w:val="left"/>
+      <w:pPr>
+        <w:ind w:left="720" w:hanging="360"/>
+      </w:pPr>
+      <w:rPr>
+        <w:rFonts w:hint="default"/>
+      </w:rPr>
+    </w:lvl>
+    <w:lvl w:ilvl="1" w:tplc="04090019" w:tentative="1">
+      <w:start w:val="1"/>
+      <w:numFmt w:val="lowerLetter"/>
+      <w:lvlText w:val="%2."/>
+      <w:lvlJc w:val="left"/>
+      <w:pPr>
+        <w:ind w:left="1440" w:hanging="360"/>
+      </w:pPr>
+    </w:lvl>
+    <w:lvl w:ilvl="2" w:tplc="0409001B" w:tentative="1">
+      <w:start w:val="1"/>
+      <w:numFmt w:val="lowerRoman"/>
+      <w:lvlText w:val="%3."/>
+      <w:lvlJc w:val="right"/>
+      <w:pPr>
+        <w:ind w:left="2160" w:hanging="180"/>
+      </w:pPr>
+    </w:lvl>
+    <w:lvl w:ilvl="3" w:tplc="0409000F" w:tentative="1">
+      <w:start w:val="1"/>
+      <w:numFmt w:val="decimal"/>
+      <w:lvlText w:val="%4."/>
+      <w:lvlJc w:val="left"/>
+      <w:pPr>
+        <w:ind w:left="2880" w:hanging="360"/>
+      </w:pPr>
+    </w:lvl>
+    <w:lvl w:ilvl="4" w:tplc="04090019" w:tentative="1">
+      <w:start w:val="1"/>
+      <w:numFmt w:val="lowerLetter"/>
+      <w:lvlText w:val="%5."/>
+      <w:lvlJc w:val="left"/>
+      <w:pPr>
+        <w:ind w:left="3600" w:hanging="360"/>
+      </w:pPr>
+    </w:lvl>
+    <w:lvl w:ilvl="5" w:tplc="0409001B" w:tentative="1">
+      <w:start w:val="1"/>
+      <w:numFmt w:val="lowerRoman"/>
+      <w:lvlText w:val="%6."/>
+      <w:lvlJc w:val="right"/>
+      <w:pPr>
+        <w:ind w:left="4320" w:hanging="180"/>
+      </w:pPr>
+    </w:lvl>
+    <w:lvl w:ilvl="6" w:tplc="0409000F" w:tentative="1">
+      <w:start w:val="1"/>
+      <w:numFmt w:val="decimal"/>
+      <w:lvlText w:val="%7."/>
+      <w:lvlJc w:val="left"/>
+      <w:pPr>
+        <w:ind w:left="5040" w:hanging="360"/>
+      </w:pPr>
+    </w:lvl>
+    <w:lvl w:ilvl="7" w:tplc="04090019" w:tentative="1">
+      <w:start w:val="1"/>
+      <w:numFmt w:val="lowerLetter"/>
+      <w:lvlText w:val="%8."/>
+      <w:lvlJc w:val="left"/>
+      <w:pPr>
+        <w:ind w:left="5760" w:hanging="360"/>
+      </w:pPr>
+    </w:lvl>
+    <w:lvl w:ilvl="8" w:tplc="0409001B" w:tentative="1">
+      <w:start w:val="1"/>
+      <w:numFmt w:val="lowerRoman"/>
+      <w:lvlText w:val="%9."/>
+      <w:lvlJc w:val="right"/>
+      <w:pPr>
+        <w:ind w:left="6480" w:hanging="180"/>
+      </w:pPr>
+    </w:lvl>
+  </w:abstractNum>
+  <w:abstractNum w:abstractNumId="5" w15:restartNumberingAfterBreak="0">
     <w:nsid w:val="755763D4"/>
     <w:multiLevelType w:val="hybridMultilevel"/>
     <w:tmpl w:val="A5683AEA"/>
@@ -1509,7 +2044,7 @@
     </w:lvl>
   </w:abstractNum>
   <w:num w:numId="1" w16cid:durableId="1143961036">
-    <w:abstractNumId w:val="3"/>
+    <w:abstractNumId w:val="5"/>
     <w:lvlOverride w:ilvl="0">
       <w:startOverride w:val="1"/>
     </w:lvlOverride>
@@ -1539,13 +2074,19 @@
     </w:lvlOverride>
   </w:num>
   <w:num w:numId="2" w16cid:durableId="2022392978">
-    <w:abstractNumId w:val="0"/>
+    <w:abstractNumId w:val="1"/>
   </w:num>
   <w:num w:numId="3" w16cid:durableId="490104361">
+    <w:abstractNumId w:val="3"/>
+  </w:num>
+  <w:num w:numId="4" w16cid:durableId="1346251564">
     <w:abstractNumId w:val="2"/>
   </w:num>
-  <w:num w:numId="4" w16cid:durableId="1346251564">
-    <w:abstractNumId w:val="1"/>
+  <w:num w:numId="5" w16cid:durableId="219442590">
+    <w:abstractNumId w:val="4"/>
+  </w:num>
+  <w:num w:numId="6" w16cid:durableId="1712025478">
+    <w:abstractNumId w:val="0"/>
   </w:num>
 </w:numbering>
 </file>
@@ -1956,6 +2497,7 @@
   <w:style w:type="character" w:default="1" w:styleId="DefaultParagraphFont">
     <w:name w:val="Default Paragraph Font"/>
     <w:uiPriority w:val="1"/>
+    <w:semiHidden/>
     <w:unhideWhenUsed/>
   </w:style>
   <w:style w:type="table" w:default="1" w:styleId="TableNormal">
@@ -2180,6 +2722,25 @@
     <w:name w:val="page number"/>
     <w:basedOn w:val="DefaultParagraphFont"/>
     <w:rsid w:val="0028364F"/>
+  </w:style>
+  <w:style w:type="paragraph" w:styleId="Caption">
+    <w:name w:val="caption"/>
+    <w:basedOn w:val="Normal"/>
+    <w:next w:val="Normal"/>
+    <w:uiPriority w:val="35"/>
+    <w:unhideWhenUsed/>
+    <w:qFormat/>
+    <w:rsid w:val="00683BDB"/>
+    <w:pPr>
+      <w:spacing w:after="200" w:line="240" w:lineRule="auto"/>
+    </w:pPr>
+    <w:rPr>
+      <w:i/>
+      <w:iCs/>
+      <w:color w:val="44546A" w:themeColor="text2"/>
+      <w:sz w:val="18"/>
+      <w:szCs w:val="18"/>
+    </w:rPr>
   </w:style>
 </w:styles>
 </file>

</xml_diff>